<commit_message>
Uploads Team Password Policy
</commit_message>
<xml_diff>
--- a/Khoi/TranLeMinhKhoi_Task10_ProcessRecord.docx
+++ b/Khoi/TranLeMinhKhoi_Task10_ProcessRecord.docx
@@ -17,70 +17,8 @@
           <w:sz w:val="28"/>
           <w:szCs w:val="28"/>
         </w:rPr>
-        <w:t xml:space="preserve">Các </w:t>
-      </w:r>
-      <w:proofErr w:type="spellStart"/>
-      <w:r>
-        <w:rPr>
-          <w:rFonts w:ascii="Times New Roman" w:hAnsi="Times New Roman" w:cs="Times New Roman"/>
-          <w:sz w:val="28"/>
-          <w:szCs w:val="28"/>
-        </w:rPr>
-        <w:t>bước</w:t>
-      </w:r>
-      <w:proofErr w:type="spellEnd"/>
-      <w:r>
-        <w:rPr>
-          <w:rFonts w:ascii="Times New Roman" w:hAnsi="Times New Roman" w:cs="Times New Roman"/>
-          <w:sz w:val="28"/>
-          <w:szCs w:val="28"/>
-        </w:rPr>
-        <w:t xml:space="preserve"> </w:t>
-      </w:r>
-      <w:proofErr w:type="spellStart"/>
-      <w:r>
-        <w:rPr>
-          <w:rFonts w:ascii="Times New Roman" w:hAnsi="Times New Roman" w:cs="Times New Roman"/>
-          <w:sz w:val="28"/>
-          <w:szCs w:val="28"/>
-        </w:rPr>
-        <w:t>tạo</w:t>
-      </w:r>
-      <w:proofErr w:type="spellEnd"/>
-      <w:r>
-        <w:rPr>
-          <w:rFonts w:ascii="Times New Roman" w:hAnsi="Times New Roman" w:cs="Times New Roman"/>
-          <w:sz w:val="28"/>
-          <w:szCs w:val="28"/>
-        </w:rPr>
-        <w:t xml:space="preserve"> </w:t>
-      </w:r>
-      <w:r>
-        <w:rPr>
-          <w:rFonts w:ascii="Times New Roman" w:hAnsi="Times New Roman" w:cs="Times New Roman"/>
-          <w:sz w:val="28"/>
-          <w:szCs w:val="28"/>
-        </w:rPr>
-        <w:t>Repository</w:t>
-      </w:r>
-      <w:r>
-        <w:rPr>
-          <w:rFonts w:ascii="Times New Roman" w:hAnsi="Times New Roman" w:cs="Times New Roman"/>
-          <w:sz w:val="28"/>
-          <w:szCs w:val="28"/>
-        </w:rPr>
-        <w:t xml:space="preserve"> </w:t>
-      </w:r>
-      <w:proofErr w:type="spellStart"/>
-      <w:r>
-        <w:rPr>
-          <w:rFonts w:ascii="Times New Roman" w:hAnsi="Times New Roman" w:cs="Times New Roman"/>
-          <w:sz w:val="28"/>
-          <w:szCs w:val="28"/>
-        </w:rPr>
-        <w:t>github</w:t>
-      </w:r>
-      <w:proofErr w:type="spellEnd"/>
+        <w:t>Steps to Create a GitHub Repository</w:t>
+      </w:r>
     </w:p>
     <w:p>
       <w:pPr>
@@ -91,61 +29,35 @@
           <w:szCs w:val="28"/>
         </w:rPr>
       </w:pPr>
-      <w:proofErr w:type="spellStart"/>
-      <w:r>
-        <w:rPr>
-          <w:rFonts w:ascii="Times New Roman" w:hAnsi="Times New Roman" w:cs="Times New Roman"/>
-          <w:sz w:val="28"/>
-          <w:szCs w:val="28"/>
-        </w:rPr>
-        <w:t>Truy</w:t>
-      </w:r>
-      <w:proofErr w:type="spellEnd"/>
-      <w:r>
-        <w:rPr>
-          <w:rFonts w:ascii="Times New Roman" w:hAnsi="Times New Roman" w:cs="Times New Roman"/>
-          <w:sz w:val="28"/>
-          <w:szCs w:val="28"/>
-        </w:rPr>
-        <w:t xml:space="preserve"> </w:t>
-      </w:r>
-      <w:proofErr w:type="spellStart"/>
-      <w:r>
-        <w:rPr>
-          <w:rFonts w:ascii="Times New Roman" w:hAnsi="Times New Roman" w:cs="Times New Roman"/>
-          <w:sz w:val="28"/>
-          <w:szCs w:val="28"/>
-        </w:rPr>
-        <w:t>cập</w:t>
-      </w:r>
-      <w:proofErr w:type="spellEnd"/>
-      <w:r>
-        <w:rPr>
-          <w:rFonts w:ascii="Times New Roman" w:hAnsi="Times New Roman" w:cs="Times New Roman"/>
-          <w:sz w:val="28"/>
-          <w:szCs w:val="28"/>
-        </w:rPr>
-        <w:t xml:space="preserve"> </w:t>
-      </w:r>
-      <w:hyperlink r:id="rId4" w:history="1">
+      <w:r>
+        <w:rPr>
+          <w:rFonts w:ascii="Times New Roman" w:hAnsi="Times New Roman" w:cs="Times New Roman"/>
+          <w:sz w:val="28"/>
+          <w:szCs w:val="28"/>
+        </w:rPr>
+        <w:t xml:space="preserve">1 </w:t>
+      </w:r>
+      <w:r>
+        <w:rPr>
+          <w:rFonts w:ascii="Times New Roman" w:hAnsi="Times New Roman" w:cs="Times New Roman"/>
+          <w:sz w:val="28"/>
+          <w:szCs w:val="28"/>
+        </w:rPr>
+        <w:t xml:space="preserve">Go to </w:t>
+      </w:r>
+      <w:hyperlink r:id="rId5" w:tgtFrame="_new" w:history="1">
         <w:r>
           <w:rPr>
             <w:rStyle w:val="Hyperlink"/>
             <w:rFonts w:ascii="Times New Roman" w:hAnsi="Times New Roman" w:cs="Times New Roman"/>
+            <w:b/>
+            <w:bCs/>
             <w:sz w:val="28"/>
             <w:szCs w:val="28"/>
           </w:rPr>
           <w:t>https://github.com/</w:t>
         </w:r>
       </w:hyperlink>
-      <w:r>
-        <w:rPr>
-          <w:rFonts w:ascii="Times New Roman" w:hAnsi="Times New Roman" w:cs="Times New Roman"/>
-          <w:sz w:val="28"/>
-          <w:szCs w:val="28"/>
-        </w:rPr>
-        <w:t xml:space="preserve"> </w:t>
-      </w:r>
     </w:p>
     <w:p>
       <w:pPr>
@@ -162,61 +74,33 @@
           <w:sz w:val="28"/>
           <w:szCs w:val="28"/>
         </w:rPr>
-        <w:t xml:space="preserve">Click New ở </w:t>
-      </w:r>
-      <w:proofErr w:type="spellStart"/>
-      <w:r>
-        <w:rPr>
-          <w:rFonts w:ascii="Times New Roman" w:hAnsi="Times New Roman" w:cs="Times New Roman"/>
-          <w:sz w:val="28"/>
-          <w:szCs w:val="28"/>
-        </w:rPr>
-        <w:t>phía</w:t>
-      </w:r>
-      <w:proofErr w:type="spellEnd"/>
-      <w:r>
-        <w:rPr>
-          <w:rFonts w:ascii="Times New Roman" w:hAnsi="Times New Roman" w:cs="Times New Roman"/>
-          <w:sz w:val="28"/>
-          <w:szCs w:val="28"/>
-        </w:rPr>
-        <w:t xml:space="preserve"> </w:t>
-      </w:r>
-      <w:proofErr w:type="spellStart"/>
-      <w:r>
-        <w:rPr>
-          <w:rFonts w:ascii="Times New Roman" w:hAnsi="Times New Roman" w:cs="Times New Roman"/>
-          <w:sz w:val="28"/>
-          <w:szCs w:val="28"/>
-        </w:rPr>
-        <w:t>bên</w:t>
-      </w:r>
-      <w:proofErr w:type="spellEnd"/>
-      <w:r>
-        <w:rPr>
-          <w:rFonts w:ascii="Times New Roman" w:hAnsi="Times New Roman" w:cs="Times New Roman"/>
-          <w:sz w:val="28"/>
-          <w:szCs w:val="28"/>
-        </w:rPr>
-        <w:t xml:space="preserve"> </w:t>
-      </w:r>
-      <w:proofErr w:type="spellStart"/>
-      <w:r>
-        <w:rPr>
-          <w:rFonts w:ascii="Times New Roman" w:hAnsi="Times New Roman" w:cs="Times New Roman"/>
-          <w:sz w:val="28"/>
-          <w:szCs w:val="28"/>
-        </w:rPr>
-        <w:t>trái</w:t>
-      </w:r>
-      <w:proofErr w:type="spellEnd"/>
-      <w:r>
-        <w:rPr>
-          <w:rFonts w:ascii="Times New Roman" w:hAnsi="Times New Roman" w:cs="Times New Roman"/>
-          <w:sz w:val="28"/>
-          <w:szCs w:val="28"/>
-        </w:rPr>
-        <w:t xml:space="preserve"> </w:t>
+        <w:t xml:space="preserve">2 </w:t>
+      </w:r>
+      <w:r>
+        <w:rPr>
+          <w:rFonts w:ascii="Times New Roman" w:hAnsi="Times New Roman" w:cs="Times New Roman"/>
+          <w:sz w:val="28"/>
+          <w:szCs w:val="28"/>
+        </w:rPr>
+        <w:t xml:space="preserve">Click </w:t>
+      </w:r>
+      <w:r>
+        <w:rPr>
+          <w:rFonts w:ascii="Times New Roman" w:hAnsi="Times New Roman" w:cs="Times New Roman"/>
+          <w:b/>
+          <w:bCs/>
+          <w:sz w:val="28"/>
+          <w:szCs w:val="28"/>
+        </w:rPr>
+        <w:t>New</w:t>
+      </w:r>
+      <w:r>
+        <w:rPr>
+          <w:rFonts w:ascii="Times New Roman" w:hAnsi="Times New Roman" w:cs="Times New Roman"/>
+          <w:sz w:val="28"/>
+          <w:szCs w:val="28"/>
+        </w:rPr>
+        <w:t xml:space="preserve"> on the left side.</w:t>
       </w:r>
     </w:p>
     <w:p>
@@ -231,6 +115,7 @@
       <w:r>
         <w:rPr>
           <w:rFonts w:ascii="Times New Roman" w:hAnsi="Times New Roman" w:cs="Times New Roman"/>
+          <w:noProof/>
           <w:sz w:val="28"/>
           <w:szCs w:val="28"/>
         </w:rPr>
@@ -250,7 +135,7 @@
                     <pic:cNvPicPr/>
                   </pic:nvPicPr>
                   <pic:blipFill>
-                    <a:blip r:embed="rId5"/>
+                    <a:blip r:embed="rId6"/>
                     <a:stretch>
                       <a:fillRect/>
                     </a:stretch>
@@ -288,53 +173,44 @@
         </w:rPr>
         <w:tab/>
       </w:r>
-      <w:proofErr w:type="spellStart"/>
-      <w:r>
-        <w:rPr>
-          <w:rFonts w:ascii="Times New Roman" w:hAnsi="Times New Roman" w:cs="Times New Roman"/>
-          <w:sz w:val="28"/>
-          <w:szCs w:val="28"/>
-        </w:rPr>
-        <w:t>Nhập</w:t>
-      </w:r>
-      <w:proofErr w:type="spellEnd"/>
-      <w:r>
-        <w:rPr>
-          <w:rFonts w:ascii="Times New Roman" w:hAnsi="Times New Roman" w:cs="Times New Roman"/>
-          <w:sz w:val="28"/>
-          <w:szCs w:val="28"/>
-        </w:rPr>
-        <w:t xml:space="preserve"> </w:t>
-      </w:r>
-      <w:r>
-        <w:rPr>
-          <w:rFonts w:ascii="Times New Roman" w:hAnsi="Times New Roman" w:cs="Times New Roman"/>
-          <w:sz w:val="28"/>
-          <w:szCs w:val="28"/>
-        </w:rPr>
-        <w:t>Repository</w:t>
-      </w:r>
-      <w:r>
-        <w:rPr>
-          <w:rFonts w:ascii="Times New Roman" w:hAnsi="Times New Roman" w:cs="Times New Roman"/>
-          <w:sz w:val="28"/>
-          <w:szCs w:val="28"/>
-        </w:rPr>
-        <w:t xml:space="preserve"> name</w:t>
-      </w:r>
-    </w:p>
-    <w:p>
-      <w:pPr>
-        <w:pStyle w:val="NoSpacing"/>
-        <w:rPr>
-          <w:rFonts w:ascii="Times New Roman" w:hAnsi="Times New Roman" w:cs="Times New Roman"/>
-          <w:sz w:val="28"/>
-          <w:szCs w:val="28"/>
-        </w:rPr>
-      </w:pPr>
-      <w:r>
-        <w:rPr>
-          <w:rFonts w:ascii="Times New Roman" w:hAnsi="Times New Roman" w:cs="Times New Roman"/>
+      <w:r>
+        <w:rPr>
+          <w:rFonts w:ascii="Times New Roman" w:hAnsi="Times New Roman" w:cs="Times New Roman"/>
+          <w:sz w:val="28"/>
+          <w:szCs w:val="28"/>
+        </w:rPr>
+        <w:t xml:space="preserve">3 </w:t>
+      </w:r>
+      <w:r>
+        <w:rPr>
+          <w:rFonts w:ascii="Times New Roman" w:hAnsi="Times New Roman" w:cs="Times New Roman"/>
+          <w:sz w:val="28"/>
+          <w:szCs w:val="28"/>
+        </w:rPr>
+        <w:t xml:space="preserve">Enter the </w:t>
+      </w:r>
+      <w:r>
+        <w:rPr>
+          <w:rFonts w:ascii="Times New Roman" w:hAnsi="Times New Roman" w:cs="Times New Roman"/>
+          <w:b/>
+          <w:bCs/>
+          <w:sz w:val="28"/>
+          <w:szCs w:val="28"/>
+        </w:rPr>
+        <w:t>Repository name</w:t>
+      </w:r>
+      <w:r>
+        <w:rPr>
+          <w:rFonts w:ascii="Times New Roman" w:hAnsi="Times New Roman" w:cs="Times New Roman"/>
+          <w:sz w:val="28"/>
+          <w:szCs w:val="28"/>
+        </w:rPr>
+        <w:t>.</w:t>
+      </w:r>
+      <w:r>
+        <w:rPr>
+          <w:rFonts w:ascii="Times New Roman" w:hAnsi="Times New Roman" w:cs="Times New Roman"/>
+          <w:noProof/>
           <w:sz w:val="28"/>
           <w:szCs w:val="28"/>
         </w:rPr>
@@ -354,7 +230,7 @@
                     <pic:cNvPicPr/>
                   </pic:nvPicPr>
                   <pic:blipFill>
-                    <a:blip r:embed="rId6"/>
+                    <a:blip r:embed="rId7"/>
                     <a:stretch>
                       <a:fillRect/>
                     </a:stretch>
@@ -410,13 +286,6 @@
           <w:szCs w:val="28"/>
         </w:rPr>
         <w:tab/>
-      </w:r>
-      <w:r>
-        <w:rPr>
-          <w:rFonts w:ascii="Times New Roman" w:hAnsi="Times New Roman" w:cs="Times New Roman"/>
-          <w:sz w:val="28"/>
-          <w:szCs w:val="28"/>
-        </w:rPr>
         <w:t>Choose visibility *</w:t>
       </w:r>
     </w:p>
@@ -446,16 +315,14 @@
         <w:tab/>
         <w:t xml:space="preserve">Public </w:t>
       </w:r>
-      <w:proofErr w:type="spellStart"/>
-      <w:r>
-        <w:rPr>
-          <w:rFonts w:ascii="Times New Roman" w:hAnsi="Times New Roman" w:cs="Times New Roman"/>
-          <w:sz w:val="28"/>
-          <w:szCs w:val="28"/>
-        </w:rPr>
-        <w:t>hoặc</w:t>
-      </w:r>
-      <w:proofErr w:type="spellEnd"/>
+      <w:r>
+        <w:rPr>
+          <w:rFonts w:ascii="Times New Roman" w:hAnsi="Times New Roman" w:cs="Times New Roman"/>
+          <w:sz w:val="28"/>
+          <w:szCs w:val="28"/>
+        </w:rPr>
+        <w:t>or</w:t>
+      </w:r>
       <w:r>
         <w:rPr>
           <w:rFonts w:ascii="Times New Roman" w:hAnsi="Times New Roman" w:cs="Times New Roman"/>
@@ -477,6 +344,7 @@
       <w:r>
         <w:rPr>
           <w:rFonts w:ascii="Times New Roman" w:hAnsi="Times New Roman" w:cs="Times New Roman"/>
+          <w:noProof/>
           <w:sz w:val="28"/>
           <w:szCs w:val="28"/>
         </w:rPr>
@@ -497,7 +365,7 @@
                     <pic:cNvPicPr/>
                   </pic:nvPicPr>
                   <pic:blipFill>
-                    <a:blip r:embed="rId7"/>
+                    <a:blip r:embed="rId8"/>
                     <a:stretch>
                       <a:fillRect/>
                     </a:stretch>
@@ -533,15 +401,7 @@
           <w:sz w:val="28"/>
           <w:szCs w:val="28"/>
         </w:rPr>
-        <w:t xml:space="preserve">Click:  create </w:t>
-      </w:r>
-      <w:r>
-        <w:rPr>
-          <w:rFonts w:ascii="Times New Roman" w:hAnsi="Times New Roman" w:cs="Times New Roman"/>
-          <w:sz w:val="28"/>
-          <w:szCs w:val="28"/>
-        </w:rPr>
-        <w:t>Repository</w:t>
+        <w:t>Click:  create Repository</w:t>
       </w:r>
     </w:p>
     <w:p>
@@ -556,6 +416,7 @@
       <w:r>
         <w:rPr>
           <w:rFonts w:ascii="Times New Roman" w:hAnsi="Times New Roman" w:cs="Times New Roman"/>
+          <w:noProof/>
           <w:sz w:val="28"/>
           <w:szCs w:val="28"/>
         </w:rPr>
@@ -575,7 +436,7 @@
                     <pic:cNvPicPr/>
                   </pic:nvPicPr>
                   <pic:blipFill>
-                    <a:blip r:embed="rId8"/>
+                    <a:blip r:embed="rId9"/>
                     <a:stretch>
                       <a:fillRect/>
                     </a:stretch>
@@ -601,105 +462,138 @@
         <w:pStyle w:val="NoSpacing"/>
         <w:rPr>
           <w:rFonts w:ascii="Times New Roman" w:hAnsi="Times New Roman" w:cs="Times New Roman"/>
-          <w:sz w:val="28"/>
-          <w:szCs w:val="28"/>
-        </w:rPr>
-      </w:pPr>
-      <w:proofErr w:type="spellStart"/>
-      <w:r>
-        <w:rPr>
-          <w:rFonts w:ascii="Times New Roman" w:hAnsi="Times New Roman" w:cs="Times New Roman"/>
-          <w:sz w:val="28"/>
-          <w:szCs w:val="28"/>
-        </w:rPr>
-        <w:t>Vào</w:t>
-      </w:r>
-      <w:proofErr w:type="spellEnd"/>
-      <w:r>
-        <w:rPr>
-          <w:rFonts w:ascii="Times New Roman" w:hAnsi="Times New Roman" w:cs="Times New Roman"/>
-          <w:sz w:val="28"/>
-          <w:szCs w:val="28"/>
-        </w:rPr>
-        <w:t xml:space="preserve"> repo</w:t>
+          <w:b/>
+          <w:bCs/>
+          <w:sz w:val="28"/>
+          <w:szCs w:val="28"/>
+        </w:rPr>
+      </w:pPr>
+      <w:r>
+        <w:rPr>
+          <w:rFonts w:ascii="Times New Roman" w:hAnsi="Times New Roman" w:cs="Times New Roman"/>
+          <w:b/>
+          <w:bCs/>
+          <w:sz w:val="28"/>
+          <w:szCs w:val="28"/>
+        </w:rPr>
+        <w:t>Add Collaborators</w:t>
       </w:r>
     </w:p>
     <w:p>
       <w:pPr>
         <w:pStyle w:val="NoSpacing"/>
-        <w:rPr>
-          <w:rFonts w:ascii="Times New Roman" w:hAnsi="Times New Roman" w:cs="Times New Roman"/>
-          <w:sz w:val="28"/>
-          <w:szCs w:val="28"/>
-        </w:rPr>
-      </w:pPr>
-      <w:r>
-        <w:rPr>
-          <w:rFonts w:ascii="Times New Roman" w:hAnsi="Times New Roman" w:cs="Times New Roman"/>
-          <w:sz w:val="28"/>
-          <w:szCs w:val="28"/>
-        </w:rPr>
-        <w:t xml:space="preserve"> </w:t>
-      </w:r>
-      <w:proofErr w:type="spellStart"/>
-      <w:r>
-        <w:rPr>
-          <w:rFonts w:ascii="Times New Roman" w:hAnsi="Times New Roman" w:cs="Times New Roman"/>
-          <w:sz w:val="28"/>
-          <w:szCs w:val="28"/>
-        </w:rPr>
-        <w:t>Chọn</w:t>
-      </w:r>
-      <w:proofErr w:type="spellEnd"/>
-      <w:r>
-        <w:rPr>
-          <w:rFonts w:ascii="Times New Roman" w:hAnsi="Times New Roman" w:cs="Times New Roman"/>
-          <w:sz w:val="28"/>
-          <w:szCs w:val="28"/>
-        </w:rPr>
-        <w:t xml:space="preserve"> Settings</w:t>
+        <w:numPr>
+          <w:ilvl w:val="0"/>
+          <w:numId w:val="1"/>
+        </w:numPr>
+        <w:rPr>
+          <w:rFonts w:ascii="Times New Roman" w:hAnsi="Times New Roman" w:cs="Times New Roman"/>
+          <w:sz w:val="28"/>
+          <w:szCs w:val="28"/>
+        </w:rPr>
+      </w:pPr>
+      <w:r>
+        <w:rPr>
+          <w:rFonts w:ascii="Times New Roman" w:hAnsi="Times New Roman" w:cs="Times New Roman"/>
+          <w:sz w:val="28"/>
+          <w:szCs w:val="28"/>
+        </w:rPr>
+        <w:t>Open the repository.</w:t>
       </w:r>
     </w:p>
     <w:p>
       <w:pPr>
         <w:pStyle w:val="NoSpacing"/>
-        <w:rPr>
-          <w:rFonts w:ascii="Times New Roman" w:hAnsi="Times New Roman" w:cs="Times New Roman"/>
-          <w:sz w:val="28"/>
-          <w:szCs w:val="28"/>
-        </w:rPr>
-      </w:pPr>
-      <w:proofErr w:type="spellStart"/>
-      <w:r>
-        <w:rPr>
-          <w:rFonts w:ascii="Times New Roman" w:hAnsi="Times New Roman" w:cs="Times New Roman"/>
-          <w:sz w:val="28"/>
-          <w:szCs w:val="28"/>
-        </w:rPr>
-        <w:t>Chọn</w:t>
-      </w:r>
-      <w:proofErr w:type="spellEnd"/>
-      <w:r>
-        <w:rPr>
-          <w:rFonts w:ascii="Times New Roman" w:hAnsi="Times New Roman" w:cs="Times New Roman"/>
-          <w:sz w:val="28"/>
-          <w:szCs w:val="28"/>
-        </w:rPr>
-        <w:t xml:space="preserve"> Collaborators</w:t>
+        <w:numPr>
+          <w:ilvl w:val="0"/>
+          <w:numId w:val="1"/>
+        </w:numPr>
+        <w:rPr>
+          <w:rFonts w:ascii="Times New Roman" w:hAnsi="Times New Roman" w:cs="Times New Roman"/>
+          <w:sz w:val="28"/>
+          <w:szCs w:val="28"/>
+        </w:rPr>
+      </w:pPr>
+      <w:r>
+        <w:rPr>
+          <w:rFonts w:ascii="Times New Roman" w:hAnsi="Times New Roman" w:cs="Times New Roman"/>
+          <w:sz w:val="28"/>
+          <w:szCs w:val="28"/>
+        </w:rPr>
+        <w:t xml:space="preserve">Click </w:t>
+      </w:r>
+      <w:r>
+        <w:rPr>
+          <w:rFonts w:ascii="Times New Roman" w:hAnsi="Times New Roman" w:cs="Times New Roman"/>
+          <w:b/>
+          <w:bCs/>
+          <w:sz w:val="28"/>
+          <w:szCs w:val="28"/>
+        </w:rPr>
+        <w:t>Settings</w:t>
+      </w:r>
+      <w:r>
+        <w:rPr>
+          <w:rFonts w:ascii="Times New Roman" w:hAnsi="Times New Roman" w:cs="Times New Roman"/>
+          <w:sz w:val="28"/>
+          <w:szCs w:val="28"/>
+        </w:rPr>
+        <w:t>.</w:t>
       </w:r>
     </w:p>
     <w:p>
       <w:pPr>
         <w:pStyle w:val="NoSpacing"/>
-        <w:rPr>
-          <w:rFonts w:ascii="Times New Roman" w:hAnsi="Times New Roman" w:cs="Times New Roman"/>
-          <w:sz w:val="28"/>
-          <w:szCs w:val="28"/>
-        </w:rPr>
-      </w:pPr>
-      <w:r>
-        <w:rPr>
-          <w:rFonts w:ascii="Times New Roman" w:hAnsi="Times New Roman" w:cs="Times New Roman"/>
+        <w:numPr>
+          <w:ilvl w:val="0"/>
+          <w:numId w:val="1"/>
+        </w:numPr>
+        <w:rPr>
+          <w:rFonts w:ascii="Times New Roman" w:hAnsi="Times New Roman" w:cs="Times New Roman"/>
+          <w:sz w:val="28"/>
+          <w:szCs w:val="28"/>
+        </w:rPr>
+      </w:pPr>
+      <w:r>
+        <w:rPr>
+          <w:rFonts w:ascii="Times New Roman" w:hAnsi="Times New Roman" w:cs="Times New Roman"/>
+          <w:sz w:val="28"/>
+          <w:szCs w:val="28"/>
+        </w:rPr>
+        <w:t xml:space="preserve">Select </w:t>
+      </w:r>
+      <w:r>
+        <w:rPr>
+          <w:rFonts w:ascii="Times New Roman" w:hAnsi="Times New Roman" w:cs="Times New Roman"/>
+          <w:b/>
+          <w:bCs/>
+          <w:sz w:val="28"/>
+          <w:szCs w:val="28"/>
+        </w:rPr>
+        <w:t>Collaborators</w:t>
+      </w:r>
+      <w:r>
+        <w:rPr>
+          <w:rFonts w:ascii="Times New Roman" w:hAnsi="Times New Roman" w:cs="Times New Roman"/>
+          <w:sz w:val="28"/>
+          <w:szCs w:val="28"/>
+        </w:rPr>
+        <w:t>.</w:t>
+      </w:r>
+    </w:p>
+    <w:p>
+      <w:pPr>
+        <w:pStyle w:val="NoSpacing"/>
+        <w:rPr>
+          <w:rFonts w:ascii="Times New Roman" w:hAnsi="Times New Roman" w:cs="Times New Roman"/>
+          <w:sz w:val="28"/>
+          <w:szCs w:val="28"/>
+        </w:rPr>
+      </w:pPr>
+      <w:r>
+        <w:rPr>
+          <w:rFonts w:ascii="Times New Roman" w:hAnsi="Times New Roman" w:cs="Times New Roman"/>
+          <w:noProof/>
           <w:sz w:val="28"/>
           <w:szCs w:val="28"/>
         </w:rPr>
@@ -719,7 +613,7 @@
                     <pic:cNvPicPr/>
                   </pic:nvPicPr>
                   <pic:blipFill>
-                    <a:blip r:embed="rId9"/>
+                    <a:blip r:embed="rId10"/>
                     <a:stretch>
                       <a:fillRect/>
                     </a:stretch>
@@ -749,23 +643,39 @@
           <w:szCs w:val="28"/>
         </w:rPr>
       </w:pPr>
-      <w:proofErr w:type="spellStart"/>
-      <w:r>
-        <w:rPr>
-          <w:rFonts w:ascii="Times New Roman" w:hAnsi="Times New Roman" w:cs="Times New Roman"/>
-          <w:sz w:val="28"/>
-          <w:szCs w:val="28"/>
-        </w:rPr>
-        <w:t>Nhấn</w:t>
-      </w:r>
-      <w:proofErr w:type="spellEnd"/>
-      <w:r>
-        <w:rPr>
-          <w:rFonts w:ascii="Times New Roman" w:hAnsi="Times New Roman" w:cs="Times New Roman"/>
-          <w:sz w:val="28"/>
-          <w:szCs w:val="28"/>
-        </w:rPr>
-        <w:t xml:space="preserve"> Add people</w:t>
+      <w:r>
+        <w:rPr>
+          <w:rFonts w:ascii="Times New Roman" w:hAnsi="Times New Roman" w:cs="Times New Roman"/>
+          <w:sz w:val="28"/>
+          <w:szCs w:val="28"/>
+        </w:rPr>
+        <w:t xml:space="preserve">9 </w:t>
+      </w:r>
+      <w:r>
+        <w:rPr>
+          <w:rFonts w:ascii="Times New Roman" w:hAnsi="Times New Roman" w:cs="Times New Roman"/>
+          <w:sz w:val="28"/>
+          <w:szCs w:val="28"/>
+        </w:rPr>
+        <w:t xml:space="preserve">Click </w:t>
+      </w:r>
+      <w:r>
+        <w:rPr>
+          <w:rFonts w:ascii="Times New Roman" w:hAnsi="Times New Roman" w:cs="Times New Roman"/>
+          <w:b/>
+          <w:bCs/>
+          <w:sz w:val="28"/>
+          <w:szCs w:val="28"/>
+        </w:rPr>
+        <w:t>Add people</w:t>
+      </w:r>
+      <w:r>
+        <w:rPr>
+          <w:rFonts w:ascii="Times New Roman" w:hAnsi="Times New Roman" w:cs="Times New Roman"/>
+          <w:sz w:val="28"/>
+          <w:szCs w:val="28"/>
+        </w:rPr>
+        <w:t>.</w:t>
       </w:r>
     </w:p>
     <w:p>
@@ -777,70 +687,40 @@
           <w:szCs w:val="28"/>
         </w:rPr>
       </w:pPr>
-      <w:proofErr w:type="spellStart"/>
-      <w:r>
-        <w:rPr>
-          <w:rFonts w:ascii="Times New Roman" w:hAnsi="Times New Roman" w:cs="Times New Roman"/>
-          <w:sz w:val="28"/>
-          <w:szCs w:val="28"/>
-        </w:rPr>
-        <w:t>Nhập</w:t>
-      </w:r>
-      <w:proofErr w:type="spellEnd"/>
-      <w:r>
-        <w:rPr>
-          <w:rFonts w:ascii="Times New Roman" w:hAnsi="Times New Roman" w:cs="Times New Roman"/>
-          <w:sz w:val="28"/>
-          <w:szCs w:val="28"/>
-        </w:rPr>
-        <w:t xml:space="preserve"> GitHub username </w:t>
-      </w:r>
-      <w:proofErr w:type="spellStart"/>
-      <w:r>
-        <w:rPr>
-          <w:rFonts w:ascii="Times New Roman" w:hAnsi="Times New Roman" w:cs="Times New Roman"/>
-          <w:sz w:val="28"/>
-          <w:szCs w:val="28"/>
-        </w:rPr>
-        <w:t>của</w:t>
-      </w:r>
-      <w:proofErr w:type="spellEnd"/>
-      <w:r>
-        <w:rPr>
-          <w:rFonts w:ascii="Times New Roman" w:hAnsi="Times New Roman" w:cs="Times New Roman"/>
-          <w:sz w:val="28"/>
-          <w:szCs w:val="28"/>
-        </w:rPr>
-        <w:t xml:space="preserve"> </w:t>
-      </w:r>
-      <w:proofErr w:type="spellStart"/>
-      <w:r>
-        <w:rPr>
-          <w:rFonts w:ascii="Times New Roman" w:hAnsi="Times New Roman" w:cs="Times New Roman"/>
-          <w:sz w:val="28"/>
-          <w:szCs w:val="28"/>
-        </w:rPr>
-        <w:t>thành</w:t>
-      </w:r>
-      <w:proofErr w:type="spellEnd"/>
-      <w:r>
-        <w:rPr>
-          <w:rFonts w:ascii="Times New Roman" w:hAnsi="Times New Roman" w:cs="Times New Roman"/>
-          <w:sz w:val="28"/>
-          <w:szCs w:val="28"/>
-        </w:rPr>
-        <w:t xml:space="preserve"> </w:t>
-      </w:r>
-      <w:proofErr w:type="spellStart"/>
-      <w:r>
-        <w:rPr>
-          <w:rFonts w:ascii="Times New Roman" w:hAnsi="Times New Roman" w:cs="Times New Roman"/>
-          <w:sz w:val="28"/>
-          <w:szCs w:val="28"/>
-        </w:rPr>
-        <w:t>viên</w:t>
-      </w:r>
-      <w:proofErr w:type="spellEnd"/>
+      <w:r>
+        <w:rPr>
+          <w:rFonts w:ascii="Times New Roman" w:hAnsi="Times New Roman" w:cs="Times New Roman"/>
+          <w:sz w:val="28"/>
+          <w:szCs w:val="28"/>
+        </w:rPr>
+        <w:t>10</w:t>
+      </w:r>
+      <w:r>
+        <w:rPr>
+          <w:rFonts w:ascii="Times New Roman" w:hAnsi="Times New Roman" w:cs="Times New Roman"/>
+          <w:sz w:val="28"/>
+          <w:szCs w:val="28"/>
+        </w:rPr>
+        <w:t xml:space="preserve">  Enter the </w:t>
+      </w:r>
+      <w:r>
+        <w:rPr>
+          <w:rFonts w:ascii="Times New Roman" w:hAnsi="Times New Roman" w:cs="Times New Roman"/>
+          <w:b/>
+          <w:bCs/>
+          <w:sz w:val="28"/>
+          <w:szCs w:val="28"/>
+        </w:rPr>
+        <w:t>GitHub username</w:t>
+      </w:r>
+      <w:r>
+        <w:rPr>
+          <w:rFonts w:ascii="Times New Roman" w:hAnsi="Times New Roman" w:cs="Times New Roman"/>
+          <w:sz w:val="28"/>
+          <w:szCs w:val="28"/>
+        </w:rPr>
+        <w:t xml:space="preserve"> of the team member.</w:t>
+      </w:r>
     </w:p>
     <w:p>
       <w:pPr>
@@ -854,6 +734,7 @@
       <w:r>
         <w:rPr>
           <w:rFonts w:ascii="Times New Roman" w:hAnsi="Times New Roman" w:cs="Times New Roman"/>
+          <w:noProof/>
           <w:sz w:val="28"/>
           <w:szCs w:val="28"/>
         </w:rPr>
@@ -874,7 +755,7 @@
                     <pic:cNvPicPr/>
                   </pic:nvPicPr>
                   <pic:blipFill>
-                    <a:blip r:embed="rId10"/>
+                    <a:blip r:embed="rId11"/>
                     <a:stretch>
                       <a:fillRect/>
                     </a:stretch>
@@ -925,6 +806,7 @@
       <w:r>
         <w:rPr>
           <w:rFonts w:ascii="Times New Roman" w:hAnsi="Times New Roman" w:cs="Times New Roman"/>
+          <w:noProof/>
           <w:sz w:val="28"/>
           <w:szCs w:val="28"/>
         </w:rPr>
@@ -944,7 +826,7 @@
                     <pic:cNvPicPr/>
                   </pic:nvPicPr>
                   <pic:blipFill>
-                    <a:blip r:embed="rId11"/>
+                    <a:blip r:embed="rId12"/>
                     <a:stretch>
                       <a:fillRect/>
                     </a:stretch>
@@ -983,6 +865,127 @@
     </w:sectPr>
   </w:body>
 </w:document>
+</file>
+
+<file path=word/numbering.xml><?xml version="1.0" encoding="utf-8"?>
+<w:numbering xmlns:wpc="http://schemas.microsoft.com/office/word/2010/wordprocessingCanvas" xmlns:cx="http://schemas.microsoft.com/office/drawing/2014/chartex" xmlns:cx1="http://schemas.microsoft.com/office/drawing/2015/9/8/chartex" xmlns:cx2="http://schemas.microsoft.com/office/drawing/2015/10/21/chartex" xmlns:cx3="http://schemas.microsoft.com/office/drawing/2016/5/9/chartex" xmlns:cx4="http://schemas.microsoft.com/office/drawing/2016/5/10/chartex" xmlns:cx5="http://schemas.microsoft.com/office/drawing/2016/5/11/chartex" xmlns:cx6="http://schemas.microsoft.com/office/drawing/2016/5/12/chartex" xmlns:cx7="http://schemas.microsoft.com/office/drawing/2016/5/13/chartex" xmlns:cx8="http://schemas.microsoft.com/office/drawing/2016/5/14/chartex" xmlns:mc="http://schemas.openxmlformats.org/markup-compatibility/2006" xmlns:aink="http://schemas.microsoft.com/office/drawing/2016/ink" xmlns:am3d="http://schemas.microsoft.com/office/drawing/2017/model3d" xmlns:o="urn:schemas-microsoft-com:office:office" xmlns:oel="http://schemas.microsoft.com/office/2019/extlst" xmlns:r="http://schemas.openxmlformats.org/officeDocument/2006/relationships" xmlns:m="http://schemas.openxmlformats.org/officeDocument/2006/math" xmlns:v="urn:schemas-microsoft-com:vml" xmlns:wp14="http://schemas.microsoft.com/office/word/2010/wordprocessingDrawing" xmlns:wp="http://schemas.openxmlformats.org/drawingml/2006/wordprocessingDrawing" xmlns:w10="urn:schemas-microsoft-com:office:word" xmlns:w="http://schemas.openxmlformats.org/wordprocessingml/2006/main" xmlns:w14="http://schemas.microsoft.com/office/word/2010/wordml" xmlns:w15="http://schemas.microsoft.com/office/word/2012/wordml" xmlns:w16cex="http://schemas.microsoft.com/office/word/2018/wordml/cex" xmlns:w16cid="http://schemas.microsoft.com/office/word/2016/wordml/cid" xmlns:w16="http://schemas.microsoft.com/office/word/2018/wordml" xmlns:w16du="http://schemas.microsoft.com/office/word/2023/wordml/word16du" xmlns:w16sdtdh="http://schemas.microsoft.com/office/word/2020/wordml/sdtdatahash" xmlns:w16sdtfl="http://schemas.microsoft.com/office/word/2024/wordml/sdtformatlock" xmlns:w16se="http://schemas.microsoft.com/office/word/2015/wordml/symex" xmlns:wpg="http://schemas.microsoft.com/office/word/2010/wordprocessingGroup" xmlns:wpi="http://schemas.microsoft.com/office/word/2010/wordprocessingInk" xmlns:wne="http://schemas.microsoft.com/office/word/2006/wordml" xmlns:wps="http://schemas.microsoft.com/office/word/2010/wordprocessingShape" mc:Ignorable="w14 w15 w16se w16cid w16 w16cex w16sdtdh w16sdtfl w16du wp14">
+  <w:abstractNum w:abstractNumId="0" w15:restartNumberingAfterBreak="0">
+    <w:nsid w:val="6AF62987"/>
+    <w:multiLevelType w:val="multilevel"/>
+    <w:tmpl w:val="98AEFACC"/>
+    <w:lvl w:ilvl="0">
+      <w:start w:val="6"/>
+      <w:numFmt w:val="decimal"/>
+      <w:lvlText w:val="%1."/>
+      <w:lvlJc w:val="left"/>
+      <w:pPr>
+        <w:tabs>
+          <w:tab w:val="num" w:pos="720"/>
+        </w:tabs>
+        <w:ind w:left="720" w:hanging="360"/>
+      </w:pPr>
+    </w:lvl>
+    <w:lvl w:ilvl="1" w:tentative="1">
+      <w:start w:val="1"/>
+      <w:numFmt w:val="decimal"/>
+      <w:lvlText w:val="%2."/>
+      <w:lvlJc w:val="left"/>
+      <w:pPr>
+        <w:tabs>
+          <w:tab w:val="num" w:pos="1440"/>
+        </w:tabs>
+        <w:ind w:left="1440" w:hanging="360"/>
+      </w:pPr>
+    </w:lvl>
+    <w:lvl w:ilvl="2" w:tentative="1">
+      <w:start w:val="1"/>
+      <w:numFmt w:val="decimal"/>
+      <w:lvlText w:val="%3."/>
+      <w:lvlJc w:val="left"/>
+      <w:pPr>
+        <w:tabs>
+          <w:tab w:val="num" w:pos="2160"/>
+        </w:tabs>
+        <w:ind w:left="2160" w:hanging="360"/>
+      </w:pPr>
+    </w:lvl>
+    <w:lvl w:ilvl="3" w:tentative="1">
+      <w:start w:val="1"/>
+      <w:numFmt w:val="decimal"/>
+      <w:lvlText w:val="%4."/>
+      <w:lvlJc w:val="left"/>
+      <w:pPr>
+        <w:tabs>
+          <w:tab w:val="num" w:pos="2880"/>
+        </w:tabs>
+        <w:ind w:left="2880" w:hanging="360"/>
+      </w:pPr>
+    </w:lvl>
+    <w:lvl w:ilvl="4" w:tentative="1">
+      <w:start w:val="1"/>
+      <w:numFmt w:val="decimal"/>
+      <w:lvlText w:val="%5."/>
+      <w:lvlJc w:val="left"/>
+      <w:pPr>
+        <w:tabs>
+          <w:tab w:val="num" w:pos="3600"/>
+        </w:tabs>
+        <w:ind w:left="3600" w:hanging="360"/>
+      </w:pPr>
+    </w:lvl>
+    <w:lvl w:ilvl="5" w:tentative="1">
+      <w:start w:val="1"/>
+      <w:numFmt w:val="decimal"/>
+      <w:lvlText w:val="%6."/>
+      <w:lvlJc w:val="left"/>
+      <w:pPr>
+        <w:tabs>
+          <w:tab w:val="num" w:pos="4320"/>
+        </w:tabs>
+        <w:ind w:left="4320" w:hanging="360"/>
+      </w:pPr>
+    </w:lvl>
+    <w:lvl w:ilvl="6" w:tentative="1">
+      <w:start w:val="1"/>
+      <w:numFmt w:val="decimal"/>
+      <w:lvlText w:val="%7."/>
+      <w:lvlJc w:val="left"/>
+      <w:pPr>
+        <w:tabs>
+          <w:tab w:val="num" w:pos="5040"/>
+        </w:tabs>
+        <w:ind w:left="5040" w:hanging="360"/>
+      </w:pPr>
+    </w:lvl>
+    <w:lvl w:ilvl="7" w:tentative="1">
+      <w:start w:val="1"/>
+      <w:numFmt w:val="decimal"/>
+      <w:lvlText w:val="%8."/>
+      <w:lvlJc w:val="left"/>
+      <w:pPr>
+        <w:tabs>
+          <w:tab w:val="num" w:pos="5760"/>
+        </w:tabs>
+        <w:ind w:left="5760" w:hanging="360"/>
+      </w:pPr>
+    </w:lvl>
+    <w:lvl w:ilvl="8" w:tentative="1">
+      <w:start w:val="1"/>
+      <w:numFmt w:val="decimal"/>
+      <w:lvlText w:val="%9."/>
+      <w:lvlJc w:val="left"/>
+      <w:pPr>
+        <w:tabs>
+          <w:tab w:val="num" w:pos="6480"/>
+        </w:tabs>
+        <w:ind w:left="6480" w:hanging="360"/>
+      </w:pPr>
+    </w:lvl>
+  </w:abstractNum>
+  <w:num w:numId="1" w16cid:durableId="21785467">
+    <w:abstractNumId w:val="0"/>
+  </w:num>
+</w:numbering>
 </file>
 
 <file path=word/styles.xml><?xml version="1.0" encoding="utf-8"?>

</xml_diff>